<commit_message>
Add AI Services Terms section and Voice/Pulse add-ons
- Add AI Services Terms section to DOCX template (after Website Package block)
- Wire contract_ai_terms_block into DocuSign action addonSections
- Add Voice and Pulse add-ons with pricing to pricing calculator
- Remove Maestro trigger from pricing calculator

Co-Authored-By: Claude Sonnet 4.6 <noreply@anthropic.com>
</commit_message>
<xml_diff>
--- a/Barespace_Subscription_Contract_Template_v2_3.docx
+++ b/Barespace_Subscription_Contract_Template_v2_3.docx
@@ -1450,6 +1450,48 @@
           <w:szCs w:val="22"/>
         </w:rPr>
         <w:t xml:space="preserve">[[contract_website_clause_block]]</w:t>
+      </w:r>
+    </w:p>
+    <w:p>
+      <w:pPr>
+        <w:pBdr>
+          <w:bottom w:val="single" w:color="B2EDD8" w:sz="8"/>
+        </w:pBdr>
+        <w:spacing w:after="180" w:before="260"/>
+      </w:pPr>
+      <w:r>
+        <w:rPr>
+          <w:rFonts w:ascii="Special Gothic Expanded" w:cs="Special Gothic Expanded" w:eastAsia="Special Gothic Expanded" w:hAnsi="Special Gothic Expanded"/>
+          <w:b/>
+          <w:bCs/>
+          <w:color w:val="07756C"/>
+          <w:sz w:val="26"/>
+          <w:szCs w:val="26"/>
+        </w:rPr>
+        <w:t xml:space="preserve">AI Services Terms</w:t>
+      </w:r>
+    </w:p>
+    <w:p>
+      <w:pPr>
+        <w:pBdr>
+          <w:top w:val="single" w:color="B2EDD8" w:sz="4"/>
+          <w:bottom w:val="single" w:color="B2EDD8" w:sz="4"/>
+          <w:left w:val="single" w:color="B2EDD8" w:sz="4"/>
+          <w:right w:val="single" w:color="B2EDD8" w:sz="4"/>
+        </w:pBdr>
+        <w:shd w:fill="FFF0FF" w:val="clear"/>
+        <w:spacing w:after="300"/>
+      </w:pPr>
+      <w:r>
+        <w:rPr>
+          <w:rFonts w:ascii="Merriweather" w:cs="Merriweather" w:eastAsia="Merriweather" w:hAnsi="Merriweather"/>
+          <w:i/>
+          <w:iCs/>
+          <w:color w:val="555B63"/>
+          <w:sz w:val="22"/>
+          <w:szCs w:val="22"/>
+        </w:rPr>
+        <w:t xml:space="preserve">[[contract_ai_terms_block]]</w:t>
       </w:r>
     </w:p>
     <w:p>

</xml_diff>

<commit_message>
Add Early Termination clause for 12-month contracts
- DOCX: add Early Termination section after AI Terms block
- Pricing calculator: buildEarlyTerminationBlock() — €500/£500 based on pipeline, only populates for 12-month deals
- DocuSign action: pass contract_early_termination_block through; strips section when empty (rolling deals)

Co-Authored-By: Claude Sonnet 4.6 <noreply@anthropic.com>
</commit_message>
<xml_diff>
--- a/Barespace_Subscription_Contract_Template_v2_3.docx
+++ b/Barespace_Subscription_Contract_Template_v2_3.docx
@@ -1492,6 +1492,48 @@
           <w:szCs w:val="22"/>
         </w:rPr>
         <w:t xml:space="preserve">[[contract_ai_terms_block]]</w:t>
+      </w:r>
+    </w:p>
+    <w:p>
+      <w:pPr>
+        <w:pBdr>
+          <w:bottom w:val="single" w:color="B2EDD8" w:sz="8"/>
+        </w:pBdr>
+        <w:spacing w:after="180" w:before="260"/>
+      </w:pPr>
+      <w:r>
+        <w:rPr>
+          <w:rFonts w:ascii="Special Gothic Expanded" w:cs="Special Gothic Expanded" w:eastAsia="Special Gothic Expanded" w:hAnsi="Special Gothic Expanded"/>
+          <w:b/>
+          <w:bCs/>
+          <w:color w:val="07756C"/>
+          <w:sz w:val="26"/>
+          <w:szCs w:val="26"/>
+        </w:rPr>
+        <w:t xml:space="preserve">Early Termination</w:t>
+      </w:r>
+    </w:p>
+    <w:p>
+      <w:pPr>
+        <w:pBdr>
+          <w:top w:val="single" w:color="B2EDD8" w:sz="4"/>
+          <w:bottom w:val="single" w:color="B2EDD8" w:sz="4"/>
+          <w:left w:val="single" w:color="B2EDD8" w:sz="4"/>
+          <w:right w:val="single" w:color="B2EDD8" w:sz="4"/>
+        </w:pBdr>
+        <w:shd w:fill="FFF0FF" w:val="clear"/>
+        <w:spacing w:after="300"/>
+      </w:pPr>
+      <w:r>
+        <w:rPr>
+          <w:rFonts w:ascii="Merriweather" w:cs="Merriweather" w:eastAsia="Merriweather" w:hAnsi="Merriweather"/>
+          <w:i/>
+          <w:iCs/>
+          <w:color w:val="555B63"/>
+          <w:sz w:val="22"/>
+          <w:szCs w:val="22"/>
+        </w:rPr>
+        <w:t xml:space="preserve">[[contract_early_termination_block]]</w:t>
       </w:r>
     </w:p>
     <w:p>

</xml_diff>